<commit_message>
Update exam prep suite with final 147 questions and URI abbreviation after cross-check
</commit_message>
<xml_diff>
--- a/study_guides/Markup_Memorization_Checklist.docx
+++ b/study_guides/Markup_Memorization_Checklist.docx
@@ -8173,6 +8173,132 @@
                 <w:sz w:val="18"/>
               </w:rPr>
               <w:t>[ ] C3W (Consortium Web Wide World)</w:t>
+            </w:r>
+          </w:p>
+        </w:tc>
+      </w:tr>
+      <w:tr>
+        <w:tc>
+          <w:tcPr>
+            <w:tcW w:type="dxa" w:w="1152"/>
+            <w:tcMar>
+              <w:top w:w="80" w:type="dxa"/>
+              <w:bottom w:w="80" w:type="dxa"/>
+              <w:left w:w="100" w:type="dxa"/>
+              <w:right w:w="100" w:type="dxa"/>
+            </w:tcMar>
+          </w:tcPr>
+          <w:p>
+            <w:pPr>
+              <w:spacing w:before="120"/>
+              <w:jc w:val="center"/>
+            </w:pPr>
+            <w:r>
+              <w:rPr>
+                <w:color w:val="94A3B8"/>
+                <w:sz w:val="22"/>
+              </w:rPr>
+              <w:t>[   ]</w:t>
+            </w:r>
+          </w:p>
+        </w:tc>
+        <w:tc>
+          <w:tcPr>
+            <w:tcW w:type="dxa" w:w="1152"/>
+            <w:tcMar>
+              <w:top w:w="80" w:type="dxa"/>
+              <w:bottom w:w="80" w:type="dxa"/>
+              <w:left w:w="100" w:type="dxa"/>
+              <w:right w:w="100" w:type="dxa"/>
+            </w:tcMar>
+          </w:tcPr>
+          <w:p>
+            <w:pPr>
+              <w:spacing w:before="120"/>
+              <w:jc w:val="center"/>
+            </w:pPr>
+            <w:r>
+              <w:rPr>
+                <w:color w:val="94A3B8"/>
+                <w:sz w:val="22"/>
+              </w:rPr>
+              <w:t>[   ]</w:t>
+            </w:r>
+          </w:p>
+        </w:tc>
+        <w:tc>
+          <w:tcPr>
+            <w:tcW w:type="dxa" w:w="7776"/>
+            <w:tcMar>
+              <w:top w:w="80" w:type="dxa"/>
+              <w:bottom w:w="80" w:type="dxa"/>
+              <w:left w:w="100" w:type="dxa"/>
+              <w:right w:w="100" w:type="dxa"/>
+            </w:tcMar>
+          </w:tcPr>
+          <w:p>
+            <w:pPr>
+              <w:spacing w:after="80"/>
+            </w:pPr>
+            <w:r>
+              <w:rPr>
+                <w:b/>
+                <w:sz w:val="20"/>
+              </w:rPr>
+              <w:t>What is the URI abbreviation?</w:t>
+            </w:r>
+          </w:p>
+          <w:p>
+            <w:pPr>
+              <w:spacing w:before="20" w:after="20"/>
+              <w:ind w:left="288"/>
+            </w:pPr>
+            <w:r>
+              <w:rPr>
+                <w:color w:val="475569"/>
+                <w:sz w:val="18"/>
+              </w:rPr>
+              <w:t>[ ] Universal Remote Informator</w:t>
+            </w:r>
+          </w:p>
+          <w:p>
+            <w:pPr>
+              <w:spacing w:before="20" w:after="20"/>
+              <w:ind w:left="288"/>
+            </w:pPr>
+            <w:r>
+              <w:rPr>
+                <w:b/>
+                <w:color w:val="10B981"/>
+                <w:sz w:val="18"/>
+              </w:rPr>
+              <w:t>[x] Uniform Resource Identifier</w:t>
+            </w:r>
+          </w:p>
+          <w:p>
+            <w:pPr>
+              <w:spacing w:before="20" w:after="20"/>
+              <w:ind w:left="288"/>
+            </w:pPr>
+            <w:r>
+              <w:rPr>
+                <w:color w:val="475569"/>
+                <w:sz w:val="18"/>
+              </w:rPr>
+              <w:t>[ ] Universal Resource Identifier</w:t>
+            </w:r>
+          </w:p>
+          <w:p>
+            <w:pPr>
+              <w:spacing w:before="20" w:after="20"/>
+              <w:ind w:left="288"/>
+            </w:pPr>
+            <w:r>
+              <w:rPr>
+                <w:color w:val="475569"/>
+                <w:sz w:val="18"/>
+              </w:rPr>
+              <w:t>[ ] Uniform Remote Identifier</w:t>
             </w:r>
           </w:p>
         </w:tc>

</xml_diff>